<commit_message>
logger + docker initializer
</commit_message>
<xml_diff>
--- a/Sprint1-Evaluation-KushagraVarshney.docx
+++ b/Sprint1-Evaluation-KushagraVarshney.docx
@@ -2046,6 +2046,111 @@
           <w:lang w:val="en-US"/>
         </w:rPr>
         <w:t>: - AMQP infrastructure</w:t>
+      </w:r>
+    </w:p>
+    <w:p>
+      <w:pPr>
+        <w:rPr>
+          <w:color w:val="000000" w:themeColor="text1"/>
+          <w:sz w:val="28"/>
+          <w:szCs w:val="28"/>
+          <w:lang w:val="en-US"/>
+        </w:rPr>
+      </w:pPr>
+    </w:p>
+    <w:p>
+      <w:pPr>
+        <w:rPr>
+          <w:color w:val="000000" w:themeColor="text1"/>
+          <w:sz w:val="28"/>
+          <w:szCs w:val="28"/>
+          <w:lang w:val="en-US"/>
+        </w:rPr>
+      </w:pPr>
+      <w:r>
+        <w:rPr>
+          <w:color w:val="000000" w:themeColor="text1"/>
+          <w:sz w:val="28"/>
+          <w:szCs w:val="28"/>
+          <w:lang w:val="en-US"/>
+        </w:rPr>
+        <w:t>Secrets and config management</w:t>
+      </w:r>
+    </w:p>
+    <w:p>
+      <w:pPr>
+        <w:rPr>
+          <w:color w:val="000000" w:themeColor="text1"/>
+          <w:sz w:val="28"/>
+          <w:szCs w:val="28"/>
+          <w:lang w:val="en-US"/>
+        </w:rPr>
+      </w:pPr>
+      <w:r>
+        <w:rPr>
+          <w:color w:val="000000" w:themeColor="text1"/>
+          <w:sz w:val="28"/>
+          <w:szCs w:val="28"/>
+          <w:lang w:val="en-US"/>
+        </w:rPr>
+        <w:t>Containers and deployment</w:t>
+      </w:r>
+    </w:p>
+    <w:p>
+      <w:pPr>
+        <w:rPr>
+          <w:color w:val="000000" w:themeColor="text1"/>
+          <w:sz w:val="28"/>
+          <w:szCs w:val="28"/>
+          <w:lang w:val="en-US"/>
+        </w:rPr>
+      </w:pPr>
+      <w:r>
+        <w:rPr>
+          <w:color w:val="000000" w:themeColor="text1"/>
+          <w:sz w:val="28"/>
+          <w:szCs w:val="28"/>
+          <w:lang w:val="en-US"/>
+        </w:rPr>
+        <w:t>Blue/green and canary</w:t>
+      </w:r>
+    </w:p>
+    <w:p>
+      <w:pPr>
+        <w:rPr>
+          <w:color w:val="000000" w:themeColor="text1"/>
+          <w:sz w:val="28"/>
+          <w:szCs w:val="28"/>
+          <w:lang w:val="en-US"/>
+        </w:rPr>
+      </w:pPr>
+      <w:r>
+        <w:rPr>
+          <w:color w:val="000000" w:themeColor="text1"/>
+          <w:sz w:val="28"/>
+          <w:szCs w:val="28"/>
+          <w:lang w:val="en-US"/>
+        </w:rPr>
+        <w:t>Best practice and anti-patterns</w:t>
+      </w:r>
+    </w:p>
+    <w:p>
+      <w:pPr>
+        <w:rPr>
+          <w:color w:val="EE0000"/>
+          <w:sz w:val="28"/>
+          <w:szCs w:val="28"/>
+          <w:lang w:val="en-US"/>
+        </w:rPr>
+      </w:pPr>
+      <w:r>
+        <w:rPr>
+          <w:color w:val="000000" w:themeColor="text1"/>
+          <w:sz w:val="28"/>
+          <w:szCs w:val="28"/>
+          <w:lang w:val="en-US"/>
+        </w:rPr>
+        <w:t>Version control system (git)</w:t>
       </w:r>
     </w:p>
     <w:sectPr>

</xml_diff>